<commit_message>
Phase 105: fix MEGA TEST 4 and the three CI-only failures
- Re-export ALG-01..ALG-20: ALG-20 cited objectives.py and
  conclusion_tables.py line numbers from before Phase 101 edited them
  (T105.4 caught it). Thesis pack rebuilt from the fresh export.
- Thesis copy check hashes SVG newline-normalized, like the other text
  suffixes: CI checks out LF, the manifest was digested from CRLF.
- The completeness checks excuse an item only when its missing file is
  gitignored (FE-03 parquet), per the standing skip-not-fail rule.

MEGA TEST 4 now 115/115 locally with --runslow; CI simulated with the
feature matrix hidden: passed/skipped, no failures.

Co-Authored-By: Claude Opus 5 <noreply@anthropic.com>
</commit_message>
<xml_diff>
--- a/outputs/14_algorithms/ALG-20_objective_achievement_evidence_generation.docx
+++ b/outputs/14_algorithms/ALG-20_objective_achievement_evidence_generation.docx
@@ -464,7 +464,7 @@
           <w:rFonts w:ascii="Consolas" w:hAnsi="Consolas"/>
           <w:sz w:val="14"/>
         </w:rPr>
-        <w:t>src/reporting/objectives.py:202  src.reporting.objectives:wording_digest</w:t>
+        <w:t>src/reporting/objectives.py:196  src.reporting.objectives:wording_digest</w:t>
       </w:r>
     </w:p>
     <w:p>
@@ -476,7 +476,7 @@
           <w:rFonts w:ascii="Consolas" w:hAnsi="Consolas"/>
           <w:sz w:val="14"/>
         </w:rPr>
-        <w:t>src/reporting/objectives.py:306  src.reporting.objectives:verify_against_source</w:t>
+        <w:t>src/reporting/objectives.py:300  src.reporting.objectives:verify_against_source</w:t>
       </w:r>
     </w:p>
     <w:p>
@@ -488,7 +488,7 @@
           <w:rFonts w:ascii="Consolas" w:hAnsi="Consolas"/>
           <w:sz w:val="14"/>
         </w:rPr>
-        <w:t>src/reporting/conclusion_tables.py:289  src.reporting.conclusion_tables:build_t29</w:t>
+        <w:t>src/reporting/conclusion_tables.py:294  src.reporting.conclusion_tables:build_t29</w:t>
       </w:r>
     </w:p>
     <w:p>
@@ -500,7 +500,7 @@
           <w:rFonts w:ascii="Consolas" w:hAnsi="Consolas"/>
           <w:sz w:val="14"/>
         </w:rPr>
-        <w:t>src/reporting/conclusion_tables.py:890  src.reporting.conclusion_tables:build_t30</w:t>
+        <w:t>src/reporting/conclusion_tables.py:895  src.reporting.conclusion_tables:build_t30</w:t>
       </w:r>
     </w:p>
     <w:p>
@@ -512,7 +512,7 @@
           <w:rFonts w:ascii="Consolas" w:hAnsi="Consolas"/>
           <w:sz w:val="14"/>
         </w:rPr>
-        <w:t>src/reporting/conclusion_tables.py:970  src.reporting.conclusion_tables:build_conclusion_tables</w:t>
+        <w:t>src/reporting/conclusion_tables.py:975  src.reporting.conclusion_tables:build_conclusion_tables</w:t>
       </w:r>
     </w:p>
     <w:p>

</xml_diff>